<commit_message>
Update UI labels, reorder fields, and enhance document header auto-fill
</commit_message>
<xml_diff>
--- a/engine/ESG_보고서_템플릿.docx
+++ b/engine/ESG_보고서_템플릿.docx
@@ -7,6 +7,21 @@
         <w:spacing w:after="120"/>
         <w:jc w:val="center"/>
         <w:rPr>
+          <w:b/>
+          <w:color w:val="1F497D"/>
+          <w:sz w:val="40"/>
+          <w:lang w:eastAsia="ko-KR"/>
+        </w:rPr>
+      </w:pPr>
+    </w:p>
+    <w:p>
+      <w:pPr>
+        <w:spacing w:after="120"/>
+        <w:jc w:val="center"/>
+        <w:rPr>
+          <w:b/>
+          <w:color w:val="1F497D"/>
+          <w:sz w:val="40"/>
           <w:lang w:eastAsia="ko-KR"/>
         </w:rPr>
       </w:pPr>
@@ -22,17 +37,30 @@
     </w:p>
     <w:p>
       <w:pPr>
+        <w:spacing w:after="120"/>
+        <w:jc w:val="center"/>
+        <w:rPr>
+          <w:lang w:eastAsia="ko-KR"/>
+        </w:rPr>
+      </w:pPr>
+    </w:p>
+    <w:p>
+      <w:pPr>
         <w:spacing w:after="80"/>
-        <w:jc w:val="center"/>
+        <w:ind w:leftChars="675" w:left="1418"/>
+        <w:rPr>
+          <w:sz w:val="22"/>
+          <w:lang w:eastAsia="ko-KR"/>
+        </w:rPr>
       </w:pPr>
-      <w:proofErr w:type="spellStart"/>
       <w:r>
         <w:rPr>
+          <w:rFonts w:hint="eastAsia"/>
           <w:sz w:val="22"/>
+          <w:lang w:eastAsia="ko-KR"/>
         </w:rPr>
-        <w:t>회사</w:t>
+        <w:t>기업</w:t>
       </w:r>
-      <w:proofErr w:type="spellEnd"/>
       <w:r>
         <w:rPr>
           <w:rFonts w:hint="eastAsia"/>
@@ -44,6 +72,7 @@
       <w:r>
         <w:rPr>
           <w:sz w:val="22"/>
+          <w:lang w:eastAsia="ko-KR"/>
         </w:rPr>
         <w:t>명: _______________________________</w:t>
       </w:r>
@@ -51,7 +80,76 @@
     <w:p>
       <w:pPr>
         <w:spacing w:after="80"/>
-        <w:jc w:val="center"/>
+        <w:ind w:leftChars="675" w:left="1418"/>
+        <w:rPr>
+          <w:sz w:val="22"/>
+          <w:lang w:eastAsia="ko-KR"/>
+        </w:rPr>
+      </w:pPr>
+      <w:r>
+        <w:rPr>
+          <w:lang w:eastAsia="ko-KR"/>
+        </w:rPr>
+        <w:t>기업(기관)</w:t>
+      </w:r>
+      <w:proofErr w:type="gramStart"/>
+      <w:r>
+        <w:rPr>
+          <w:rFonts w:hint="eastAsia"/>
+          <w:lang w:eastAsia="ko-KR"/>
+        </w:rPr>
+        <w:t>형태</w:t>
+      </w:r>
+      <w:r>
+        <w:rPr>
+          <w:lang w:eastAsia="ko-KR"/>
+        </w:rPr>
+        <w:t xml:space="preserve"> :</w:t>
+      </w:r>
+      <w:proofErr w:type="gramEnd"/>
+      <w:r>
+        <w:rPr>
+          <w:sz w:val="22"/>
+          <w:lang w:eastAsia="ko-KR"/>
+        </w:rPr>
+        <w:t xml:space="preserve"> _______________________________</w:t>
+      </w:r>
+    </w:p>
+    <w:p>
+      <w:pPr>
+        <w:spacing w:after="80"/>
+        <w:ind w:leftChars="675" w:left="1418"/>
+        <w:rPr>
+          <w:lang w:eastAsia="ko-KR"/>
+        </w:rPr>
+      </w:pPr>
+      <w:proofErr w:type="gramStart"/>
+      <w:r>
+        <w:rPr>
+          <w:lang w:eastAsia="ko-KR"/>
+        </w:rPr>
+        <w:t>산업분류 :</w:t>
+      </w:r>
+      <w:proofErr w:type="gramEnd"/>
+      <w:r>
+        <w:rPr>
+          <w:rFonts w:hint="eastAsia"/>
+          <w:lang w:eastAsia="ko-KR"/>
+        </w:rPr>
+        <w:t xml:space="preserve"> </w:t>
+      </w:r>
+      <w:r>
+        <w:rPr>
+          <w:sz w:val="22"/>
+          <w:lang w:eastAsia="ko-KR"/>
+        </w:rPr>
+        <w:t>_______________________________</w:t>
+      </w:r>
+    </w:p>
+    <w:p>
+      <w:pPr>
+        <w:spacing w:after="80"/>
+        <w:ind w:leftChars="675" w:left="1418"/>
         <w:rPr>
           <w:lang w:eastAsia="ko-KR"/>
         </w:rPr>
@@ -67,8 +165,9 @@
     <w:p>
       <w:pPr>
         <w:spacing w:after="240"/>
-        <w:jc w:val="center"/>
+        <w:ind w:leftChars="675" w:left="1418"/>
         <w:rPr>
+          <w:sz w:val="22"/>
           <w:lang w:eastAsia="ko-KR"/>
         </w:rPr>
       </w:pPr>
@@ -82,10 +181,299 @@
     </w:p>
     <w:p>
       <w:pPr>
+        <w:spacing w:after="240"/>
+        <w:ind w:leftChars="675" w:left="1418"/>
+        <w:rPr>
+          <w:sz w:val="22"/>
+          <w:lang w:eastAsia="ko-KR"/>
+        </w:rPr>
+      </w:pPr>
+    </w:p>
+    <w:p>
+      <w:pPr>
+        <w:spacing w:after="240"/>
+        <w:ind w:leftChars="675" w:left="1418"/>
+        <w:rPr>
+          <w:sz w:val="22"/>
+          <w:lang w:eastAsia="ko-KR"/>
+        </w:rPr>
+      </w:pPr>
+    </w:p>
+    <w:p>
+      <w:pPr>
+        <w:spacing w:after="0" w:line="200" w:lineRule="atLeast"/>
+        <w:jc w:val="center"/>
         <w:rPr>
           <w:lang w:eastAsia="ko-KR"/>
         </w:rPr>
       </w:pPr>
+      <w:r>
+        <w:rPr>
+          <w:rFonts w:hint="eastAsia"/>
+          <w:lang w:eastAsia="ko-KR"/>
+        </w:rPr>
+        <w:t>본 보고서는 한국ESG학회가 제공하는</w:t>
+      </w:r>
+    </w:p>
+    <w:p>
+      <w:pPr>
+        <w:spacing w:after="0" w:line="200" w:lineRule="atLeast"/>
+        <w:jc w:val="center"/>
+        <w:rPr>
+          <w:lang w:eastAsia="ko-KR"/>
+        </w:rPr>
+      </w:pPr>
+      <w:r>
+        <w:rPr>
+          <w:rFonts w:hint="eastAsia"/>
+          <w:lang w:eastAsia="ko-KR"/>
+        </w:rPr>
+        <w:t>인공지능 ESG 분석 엔진 KESGAI로 생성한</w:t>
+      </w:r>
+    </w:p>
+    <w:p>
+      <w:pPr>
+        <w:spacing w:after="0" w:line="200" w:lineRule="atLeast"/>
+        <w:jc w:val="center"/>
+        <w:rPr>
+          <w:lang w:eastAsia="ko-KR"/>
+        </w:rPr>
+      </w:pPr>
+      <w:r>
+        <w:rPr>
+          <w:rFonts w:hint="eastAsia"/>
+          <w:lang w:eastAsia="ko-KR"/>
+        </w:rPr>
+        <w:t>기관(기업) 맞춤형 ESG 가이드라인 템플릿 초안입니다.</w:t>
+      </w:r>
+    </w:p>
+    <w:p>
+      <w:pPr>
+        <w:spacing w:after="0" w:line="200" w:lineRule="atLeast"/>
+        <w:jc w:val="center"/>
+        <w:rPr>
+          <w:lang w:eastAsia="ko-KR"/>
+        </w:rPr>
+      </w:pPr>
+      <w:r>
+        <w:rPr>
+          <w:rFonts w:hint="eastAsia"/>
+          <w:lang w:eastAsia="ko-KR"/>
+        </w:rPr>
+        <w:t>실제 현황에 맞게 직접 보완하시기 바랍니다.</w:t>
+      </w:r>
+    </w:p>
+    <w:p>
+      <w:pPr>
+        <w:spacing w:after="0" w:line="200" w:lineRule="atLeast"/>
+        <w:jc w:val="center"/>
+        <w:rPr>
+          <w:b/>
+          <w:bCs/>
+          <w:lang w:eastAsia="ko-KR"/>
+        </w:rPr>
+      </w:pPr>
+      <w:r>
+        <w:rPr>
+          <w:rFonts w:hint="eastAsia"/>
+          <w:b/>
+          <w:bCs/>
+          <w:lang w:eastAsia="ko-KR"/>
+        </w:rPr>
+        <w:t xml:space="preserve">&lt;KESGAI는 Korea ESG Association </w:t>
+      </w:r>
+      <w:proofErr w:type="gramStart"/>
+      <w:r>
+        <w:rPr>
+          <w:rFonts w:hint="eastAsia"/>
+          <w:b/>
+          <w:bCs/>
+          <w:lang w:eastAsia="ko-KR"/>
+        </w:rPr>
+        <w:t>A</w:t>
+      </w:r>
+      <w:r>
+        <w:rPr>
+          <w:rFonts w:hint="eastAsia"/>
+          <w:b/>
+          <w:bCs/>
+          <w:lang w:eastAsia="ko-KR"/>
+        </w:rPr>
+        <w:t xml:space="preserve">I엔진 </w:t>
+      </w:r>
+      <w:r>
+        <w:rPr>
+          <w:rFonts w:hint="eastAsia"/>
+          <w:b/>
+          <w:bCs/>
+          <w:lang w:eastAsia="ko-KR"/>
+        </w:rPr>
+        <w:t>입니다</w:t>
+      </w:r>
+      <w:proofErr w:type="gramEnd"/>
+      <w:r>
+        <w:rPr>
+          <w:rFonts w:hint="eastAsia"/>
+          <w:b/>
+          <w:bCs/>
+          <w:lang w:eastAsia="ko-KR"/>
+        </w:rPr>
+        <w:t>.&gt;</w:t>
+      </w:r>
+    </w:p>
+    <w:p>
+      <w:pPr>
+        <w:spacing w:after="240"/>
+        <w:ind w:leftChars="675" w:left="1418"/>
+        <w:rPr>
+          <w:lang w:eastAsia="ko-KR"/>
+        </w:rPr>
+      </w:pPr>
+    </w:p>
+    <w:p>
+      <w:pPr>
+        <w:spacing w:after="240"/>
+        <w:ind w:leftChars="675" w:left="1418"/>
+        <w:rPr>
+          <w:lang w:eastAsia="ko-KR"/>
+        </w:rPr>
+      </w:pPr>
+    </w:p>
+    <w:p>
+      <w:pPr>
+        <w:spacing w:after="240"/>
+        <w:ind w:leftChars="675" w:left="1418"/>
+        <w:rPr>
+          <w:lang w:eastAsia="ko-KR"/>
+        </w:rPr>
+      </w:pPr>
+    </w:p>
+    <w:p>
+      <w:pPr>
+        <w:jc w:val="center"/>
+        <w:rPr>
+          <w:lang w:eastAsia="ko-KR"/>
+        </w:rPr>
+      </w:pPr>
+      <w:r>
+        <w:rPr>
+          <w:noProof/>
+          <w:lang w:eastAsia="ko-KR"/>
+        </w:rPr>
+        <w:drawing>
+          <wp:inline distT="0" distB="0" distL="0" distR="0" wp14:anchorId="5A851EA8" wp14:editId="3BC46F53">
+            <wp:extent cx="1914525" cy="559999"/>
+            <wp:effectExtent l="0" t="0" r="0" b="0"/>
+            <wp:docPr id="726781126" name="그림 1"/>
+            <wp:cNvGraphicFramePr>
+              <a:graphicFrameLocks xmlns:a="http://schemas.openxmlformats.org/drawingml/2006/main" noChangeAspect="1"/>
+            </wp:cNvGraphicFramePr>
+            <a:graphic xmlns:a="http://schemas.openxmlformats.org/drawingml/2006/main">
+              <a:graphicData uri="http://schemas.openxmlformats.org/drawingml/2006/picture">
+                <pic:pic xmlns:pic="http://schemas.openxmlformats.org/drawingml/2006/picture">
+                  <pic:nvPicPr>
+                    <pic:cNvPr id="0" name="Picture 1"/>
+                    <pic:cNvPicPr>
+                      <a:picLocks noChangeAspect="1" noChangeArrowheads="1"/>
+                    </pic:cNvPicPr>
+                  </pic:nvPicPr>
+                  <pic:blipFill>
+                    <a:blip r:embed="rId8">
+                      <a:extLst>
+                        <a:ext uri="{28A0092B-C50C-407E-A947-70E740481C1C}">
+                          <a14:useLocalDpi xmlns:a14="http://schemas.microsoft.com/office/drawing/2010/main" val="0"/>
+                        </a:ext>
+                      </a:extLst>
+                    </a:blip>
+                    <a:srcRect/>
+                    <a:stretch>
+                      <a:fillRect/>
+                    </a:stretch>
+                  </pic:blipFill>
+                  <pic:spPr bwMode="auto">
+                    <a:xfrm>
+                      <a:off x="0" y="0"/>
+                      <a:ext cx="1934001" cy="565696"/>
+                    </a:xfrm>
+                    <a:prstGeom prst="rect">
+                      <a:avLst/>
+                    </a:prstGeom>
+                    <a:noFill/>
+                    <a:ln>
+                      <a:noFill/>
+                    </a:ln>
+                  </pic:spPr>
+                </pic:pic>
+              </a:graphicData>
+            </a:graphic>
+          </wp:inline>
+        </w:drawing>
+      </w:r>
+    </w:p>
+    <w:p>
+      <w:pPr>
+        <w:jc w:val="center"/>
+        <w:rPr>
+          <w:lang w:eastAsia="ko-KR"/>
+        </w:rPr>
+      </w:pPr>
+    </w:p>
+    <w:p>
+      <w:pPr>
+        <w:spacing w:after="0"/>
+        <w:jc w:val="right"/>
+        <w:rPr>
+          <w:lang w:eastAsia="ko-KR"/>
+        </w:rPr>
+      </w:pPr>
+      <w:proofErr w:type="gramStart"/>
+      <w:r>
+        <w:rPr>
+          <w:rFonts w:hint="eastAsia"/>
+          <w:lang w:eastAsia="ko-KR"/>
+        </w:rPr>
+        <w:t>문의 :</w:t>
+      </w:r>
+      <w:proofErr w:type="gramEnd"/>
+      <w:r>
+        <w:rPr>
+          <w:rFonts w:hint="eastAsia"/>
+          <w:lang w:eastAsia="ko-KR"/>
+        </w:rPr>
+        <w:t xml:space="preserve"> 한국ESG학회 KESGAI보고서 지원</w:t>
+      </w:r>
+    </w:p>
+    <w:p>
+      <w:pPr>
+        <w:spacing w:after="0"/>
+        <w:jc w:val="right"/>
+        <w:rPr>
+          <w:lang w:eastAsia="ko-KR"/>
+        </w:rPr>
+      </w:pPr>
+      <w:r>
+        <w:rPr>
+          <w:rFonts w:hint="eastAsia"/>
+          <w:lang w:eastAsia="ko-KR"/>
+        </w:rPr>
+        <w:t>010-5252-4704 (</w:t>
+      </w:r>
+      <w:proofErr w:type="spellStart"/>
+      <w:r>
+        <w:rPr>
+          <w:rFonts w:hint="eastAsia"/>
+          <w:lang w:eastAsia="ko-KR"/>
+        </w:rPr>
+        <w:t>강종진</w:t>
+      </w:r>
+      <w:proofErr w:type="spellEnd"/>
+      <w:r>
+        <w:rPr>
+          <w:rFonts w:hint="eastAsia"/>
+          <w:lang w:eastAsia="ko-KR"/>
+        </w:rPr>
+        <w:t>)</w:t>
+      </w:r>
       <w:r>
         <w:rPr>
           <w:lang w:eastAsia="ko-KR"/>
@@ -114,32 +502,18 @@
     <w:p>
       <w:pPr>
         <w:spacing w:before="160" w:after="80"/>
+        <w:rPr>
+          <w:lang w:eastAsia="ko-KR"/>
+        </w:rPr>
       </w:pPr>
-      <w:proofErr w:type="spellStart"/>
       <w:r>
         <w:rPr>
           <w:b/>
           <w:sz w:val="22"/>
+          <w:lang w:eastAsia="ko-KR"/>
         </w:rPr>
-        <w:t>회사</w:t>
+        <w:t>회사 소개</w:t>
       </w:r>
-      <w:proofErr w:type="spellEnd"/>
-      <w:r>
-        <w:rPr>
-          <w:b/>
-          <w:sz w:val="22"/>
-        </w:rPr>
-        <w:t xml:space="preserve"> </w:t>
-      </w:r>
-      <w:proofErr w:type="spellStart"/>
-      <w:r>
-        <w:rPr>
-          <w:b/>
-          <w:sz w:val="22"/>
-        </w:rPr>
-        <w:t>소개</w:t>
-      </w:r>
-      <w:proofErr w:type="spellEnd"/>
     </w:p>
     <w:tbl>
       <w:tblPr>
@@ -736,14 +1110,14 @@
               <w:rPr>
                 <w:b/>
               </w:rPr>
-              <w:t>입</w:t>
+              <w:t>입력</w:t>
             </w:r>
             <w:proofErr w:type="spellEnd"/>
             <w:r>
               <w:rPr>
                 <w:b/>
               </w:rPr>
-              <w:t>력]</w:t>
+              <w:t>]</w:t>
             </w:r>
           </w:p>
         </w:tc>
@@ -889,6 +1263,7 @@
               <w:rPr>
                 <w:b/>
               </w:rPr>
+              <w:lastRenderedPageBreak/>
               <w:t>[</w:t>
             </w:r>
             <w:proofErr w:type="spellStart"/>
@@ -988,7 +1363,6 @@
           </w:p>
           <w:p>
             <w:r>
-              <w:lastRenderedPageBreak/>
               <w:t>______________________________________________</w:t>
             </w:r>
           </w:p>
@@ -2509,6 +2883,7 @@
               <w:rPr>
                 <w:b/>
               </w:rPr>
+              <w:lastRenderedPageBreak/>
               <w:t>[</w:t>
             </w:r>
             <w:proofErr w:type="spellStart"/>
@@ -2641,7 +3016,6 @@
           <w:b/>
           <w:sz w:val="22"/>
         </w:rPr>
-        <w:lastRenderedPageBreak/>
         <w:t>인사 및 복지 정책</w:t>
       </w:r>
     </w:p>
@@ -3366,7 +3740,14 @@
               <w:rPr>
                 <w:lang w:eastAsia="ko-KR"/>
               </w:rPr>
-              <w:t>[회사명]은 투명한 의사결정과 책임경영 실현을 위해 거버넌스 체계를 운영하고 있습니다.</w:t>
+              <w:t xml:space="preserve">[회사명]은 투명한 의사결정과 책임경영 실현을 위해 거버넌스 체계를 운영하고 </w:t>
+            </w:r>
+            <w:r>
+              <w:rPr>
+                <w:lang w:eastAsia="ko-KR"/>
+              </w:rPr>
+              <w:lastRenderedPageBreak/>
+              <w:t>있습니다.</w:t>
             </w:r>
           </w:p>
         </w:tc>
@@ -3389,6 +3770,7 @@
               <w:rPr>
                 <w:b/>
               </w:rPr>
+              <w:lastRenderedPageBreak/>
               <w:t>[</w:t>
             </w:r>
             <w:proofErr w:type="spellStart"/>
@@ -3588,7 +3970,6 @@
               <w:rPr>
                 <w:b/>
               </w:rPr>
-              <w:lastRenderedPageBreak/>
               <w:t>[</w:t>
             </w:r>
             <w:proofErr w:type="spellStart"/>
@@ -4172,6 +4553,7 @@
           </w:p>
           <w:p>
             <w:r>
+              <w:lastRenderedPageBreak/>
               <w:t>______________________________________________</w:t>
             </w:r>
           </w:p>
@@ -4386,7 +4768,6 @@
           </w:p>
           <w:p>
             <w:r>
-              <w:lastRenderedPageBreak/>
               <w:t>______________________________________________</w:t>
             </w:r>
           </w:p>
@@ -4411,6 +4792,8 @@
       </w:r>
     </w:p>
     <w:sectPr>
+      <w:headerReference w:type="default" r:id="rId9"/>
+      <w:footerReference w:type="default" r:id="rId10"/>
       <w:pgSz w:w="12240" w:h="15840"/>
       <w:pgMar w:top="1134" w:right="1247" w:bottom="1134" w:left="1247" w:header="720" w:footer="720" w:gutter="0"/>
       <w:pgBorders w:offsetFrom="page">
@@ -4424,6 +4807,228 @@
     </w:sectPr>
   </w:body>
 </w:document>
+</file>
+
+<file path=word/endnotes.xml><?xml version="1.0" encoding="utf-8"?>
+<w:endnotes xmlns:wpc="http://schemas.microsoft.com/office/word/2010/wordprocessingCanvas" xmlns:cx="http://schemas.microsoft.com/office/drawing/2014/chartex" xmlns:cx1="http://schemas.microsoft.com/office/drawing/2015/9/8/chartex" xmlns:cx2="http://schemas.microsoft.com/office/drawing/2015/10/21/chartex" xmlns:cx3="http://schemas.microsoft.com/office/drawing/2016/5/9/chartex" xmlns:cx4="http://schemas.microsoft.com/office/drawing/2016/5/10/chartex" xmlns:cx5="http://schemas.microsoft.com/office/drawing/2016/5/11/chartex" xmlns:cx6="http://schemas.microsoft.com/office/drawing/2016/5/12/chartex" xmlns:cx7="http://schemas.microsoft.com/office/drawing/2016/5/13/chartex" xmlns:cx8="http://schemas.microsoft.com/office/drawing/2016/5/14/chartex" xmlns:mc="http://schemas.openxmlformats.org/markup-compatibility/2006" xmlns:aink="http://schemas.microsoft.com/office/drawing/2016/ink" xmlns:am3d="http://schemas.microsoft.com/office/drawing/2017/model3d" xmlns:o="urn:schemas-microsoft-com:office:office" xmlns:oel="http://schemas.microsoft.com/office/2019/extlst" xmlns:r="http://schemas.openxmlformats.org/officeDocument/2006/relationships" xmlns:m="http://schemas.openxmlformats.org/officeDocument/2006/math" xmlns:v="urn:schemas-microsoft-com:vml" xmlns:wp14="http://schemas.microsoft.com/office/word/2010/wordprocessingDrawing" xmlns:wp="http://schemas.openxmlformats.org/drawingml/2006/wordprocessingDrawing" xmlns:w10="urn:schemas-microsoft-com:office:word" xmlns:w="http://schemas.openxmlformats.org/wordprocessingml/2006/main" xmlns:w14="http://schemas.microsoft.com/office/word/2010/wordml" xmlns:w15="http://schemas.microsoft.com/office/word/2012/wordml" xmlns:w16cex="http://schemas.microsoft.com/office/word/2018/wordml/cex" xmlns:w16cid="http://schemas.microsoft.com/office/word/2016/wordml/cid" xmlns:w16="http://schemas.microsoft.com/office/word/2018/wordml" xmlns:w16du="http://schemas.microsoft.com/office/word/2023/wordml/word16du" xmlns:w16sdtdh="http://schemas.microsoft.com/office/word/2020/wordml/sdtdatahash" xmlns:w16sdtfl="http://schemas.microsoft.com/office/word/2024/wordml/sdtformatlock" xmlns:w16se="http://schemas.microsoft.com/office/word/2015/wordml/symex" xmlns:wpg="http://schemas.microsoft.com/office/word/2010/wordprocessingGroup" xmlns:wpi="http://schemas.microsoft.com/office/word/2010/wordprocessingInk" xmlns:wne="http://schemas.microsoft.com/office/word/2006/wordml" xmlns:wps="http://schemas.microsoft.com/office/word/2010/wordprocessingShape" mc:Ignorable="w14 w15 w16se w16cid w16 w16cex w16sdtdh w16sdtfl w16du wp14">
+  <w:endnote w:type="separator" w:id="-1">
+    <w:p>
+      <w:pPr>
+        <w:spacing w:after="0" w:line="240" w:lineRule="auto"/>
+      </w:pPr>
+      <w:r>
+        <w:separator/>
+      </w:r>
+    </w:p>
+  </w:endnote>
+  <w:endnote w:type="continuationSeparator" w:id="0">
+    <w:p>
+      <w:pPr>
+        <w:spacing w:after="0" w:line="240" w:lineRule="auto"/>
+      </w:pPr>
+      <w:r>
+        <w:continuationSeparator/>
+      </w:r>
+    </w:p>
+  </w:endnote>
+</w:endnotes>
+</file>
+
+<file path=word/footer1.xml><?xml version="1.0" encoding="utf-8"?>
+<w:ftr xmlns:wpc="http://schemas.microsoft.com/office/word/2010/wordprocessingCanvas" xmlns:cx="http://schemas.microsoft.com/office/drawing/2014/chartex" xmlns:cx1="http://schemas.microsoft.com/office/drawing/2015/9/8/chartex" xmlns:cx2="http://schemas.microsoft.com/office/drawing/2015/10/21/chartex" xmlns:cx3="http://schemas.microsoft.com/office/drawing/2016/5/9/chartex" xmlns:cx4="http://schemas.microsoft.com/office/drawing/2016/5/10/chartex" xmlns:cx5="http://schemas.microsoft.com/office/drawing/2016/5/11/chartex" xmlns:cx6="http://schemas.microsoft.com/office/drawing/2016/5/12/chartex" xmlns:cx7="http://schemas.microsoft.com/office/drawing/2016/5/13/chartex" xmlns:cx8="http://schemas.microsoft.com/office/drawing/2016/5/14/chartex" xmlns:mc="http://schemas.openxmlformats.org/markup-compatibility/2006" xmlns:aink="http://schemas.microsoft.com/office/drawing/2016/ink" xmlns:am3d="http://schemas.microsoft.com/office/drawing/2017/model3d" xmlns:o="urn:schemas-microsoft-com:office:office" xmlns:oel="http://schemas.microsoft.com/office/2019/extlst" xmlns:r="http://schemas.openxmlformats.org/officeDocument/2006/relationships" xmlns:m="http://schemas.openxmlformats.org/officeDocument/2006/math" xmlns:v="urn:schemas-microsoft-com:vml" xmlns:wp14="http://schemas.microsoft.com/office/word/2010/wordprocessingDrawing" xmlns:wp="http://schemas.openxmlformats.org/drawingml/2006/wordprocessingDrawing" xmlns:w10="urn:schemas-microsoft-com:office:word" xmlns:w="http://schemas.openxmlformats.org/wordprocessingml/2006/main" xmlns:w14="http://schemas.microsoft.com/office/word/2010/wordml" xmlns:w15="http://schemas.microsoft.com/office/word/2012/wordml" xmlns:w16cex="http://schemas.microsoft.com/office/word/2018/wordml/cex" xmlns:w16cid="http://schemas.microsoft.com/office/word/2016/wordml/cid" xmlns:w16="http://schemas.microsoft.com/office/word/2018/wordml" xmlns:w16du="http://schemas.microsoft.com/office/word/2023/wordml/word16du" xmlns:w16sdtdh="http://schemas.microsoft.com/office/word/2020/wordml/sdtdatahash" xmlns:w16sdtfl="http://schemas.microsoft.com/office/word/2024/wordml/sdtformatlock" xmlns:w16se="http://schemas.microsoft.com/office/word/2015/wordml/symex" xmlns:wpg="http://schemas.microsoft.com/office/word/2010/wordprocessingGroup" xmlns:wpi="http://schemas.microsoft.com/office/word/2010/wordprocessingInk" xmlns:wne="http://schemas.microsoft.com/office/word/2006/wordml" xmlns:wps="http://schemas.microsoft.com/office/word/2010/wordprocessingShape" mc:Ignorable="w14 w15 w16se w16cid w16 w16cex w16sdtdh w16sdtfl w16du wp14">
+  <w:sdt>
+    <w:sdtPr>
+      <w:id w:val="1602137409"/>
+      <w:docPartObj>
+        <w:docPartGallery w:val="Page Numbers (Bottom of Page)"/>
+        <w:docPartUnique/>
+      </w:docPartObj>
+    </w:sdtPr>
+    <w:sdtContent>
+      <w:p>
+        <w:pPr>
+          <w:pStyle w:val="a6"/>
+          <w:jc w:val="center"/>
+        </w:pPr>
+        <w:r>
+          <w:fldChar w:fldCharType="begin"/>
+        </w:r>
+        <w:r>
+          <w:instrText>PAGE   \* MERGEFORMAT</w:instrText>
+        </w:r>
+        <w:r>
+          <w:fldChar w:fldCharType="separate"/>
+        </w:r>
+        <w:r>
+          <w:rPr>
+            <w:lang w:val="ko-KR" w:eastAsia="ko-KR"/>
+          </w:rPr>
+          <w:t>2</w:t>
+        </w:r>
+        <w:r>
+          <w:fldChar w:fldCharType="end"/>
+        </w:r>
+      </w:p>
+    </w:sdtContent>
+  </w:sdt>
+  <w:p>
+    <w:pPr>
+      <w:pStyle w:val="a6"/>
+      <w:jc w:val="right"/>
+    </w:pPr>
+    <w:r>
+      <w:rPr>
+        <w:noProof/>
+      </w:rPr>
+      <w:drawing>
+        <wp:inline distT="0" distB="0" distL="0" distR="0" wp14:anchorId="4EFD10D8" wp14:editId="354345D6">
+          <wp:extent cx="790575" cy="231243"/>
+          <wp:effectExtent l="0" t="0" r="0" b="0"/>
+          <wp:docPr id="1966045873" name="그림 3"/>
+          <wp:cNvGraphicFramePr>
+            <a:graphicFrameLocks xmlns:a="http://schemas.openxmlformats.org/drawingml/2006/main" noChangeAspect="1"/>
+          </wp:cNvGraphicFramePr>
+          <a:graphic xmlns:a="http://schemas.openxmlformats.org/drawingml/2006/main">
+            <a:graphicData uri="http://schemas.openxmlformats.org/drawingml/2006/picture">
+              <pic:pic xmlns:pic="http://schemas.openxmlformats.org/drawingml/2006/picture">
+                <pic:nvPicPr>
+                  <pic:cNvPr id="0" name="Picture 3"/>
+                  <pic:cNvPicPr>
+                    <a:picLocks noChangeAspect="1" noChangeArrowheads="1"/>
+                  </pic:cNvPicPr>
+                </pic:nvPicPr>
+                <pic:blipFill>
+                  <a:blip r:embed="rId1">
+                    <a:extLst>
+                      <a:ext uri="{28A0092B-C50C-407E-A947-70E740481C1C}">
+                        <a14:useLocalDpi xmlns:a14="http://schemas.microsoft.com/office/drawing/2010/main" val="0"/>
+                      </a:ext>
+                    </a:extLst>
+                  </a:blip>
+                  <a:srcRect/>
+                  <a:stretch>
+                    <a:fillRect/>
+                  </a:stretch>
+                </pic:blipFill>
+                <pic:spPr bwMode="auto">
+                  <a:xfrm>
+                    <a:off x="0" y="0"/>
+                    <a:ext cx="800884" cy="234258"/>
+                  </a:xfrm>
+                  <a:prstGeom prst="rect">
+                    <a:avLst/>
+                  </a:prstGeom>
+                  <a:noFill/>
+                  <a:ln>
+                    <a:noFill/>
+                  </a:ln>
+                </pic:spPr>
+              </pic:pic>
+            </a:graphicData>
+          </a:graphic>
+        </wp:inline>
+      </w:drawing>
+    </w:r>
+  </w:p>
+</w:ftr>
+</file>
+
+<file path=word/footnotes.xml><?xml version="1.0" encoding="utf-8"?>
+<w:footnotes xmlns:wpc="http://schemas.microsoft.com/office/word/2010/wordprocessingCanvas" xmlns:cx="http://schemas.microsoft.com/office/drawing/2014/chartex" xmlns:cx1="http://schemas.microsoft.com/office/drawing/2015/9/8/chartex" xmlns:cx2="http://schemas.microsoft.com/office/drawing/2015/10/21/chartex" xmlns:cx3="http://schemas.microsoft.com/office/drawing/2016/5/9/chartex" xmlns:cx4="http://schemas.microsoft.com/office/drawing/2016/5/10/chartex" xmlns:cx5="http://schemas.microsoft.com/office/drawing/2016/5/11/chartex" xmlns:cx6="http://schemas.microsoft.com/office/drawing/2016/5/12/chartex" xmlns:cx7="http://schemas.microsoft.com/office/drawing/2016/5/13/chartex" xmlns:cx8="http://schemas.microsoft.com/office/drawing/2016/5/14/chartex" xmlns:mc="http://schemas.openxmlformats.org/markup-compatibility/2006" xmlns:aink="http://schemas.microsoft.com/office/drawing/2016/ink" xmlns:am3d="http://schemas.microsoft.com/office/drawing/2017/model3d" xmlns:o="urn:schemas-microsoft-com:office:office" xmlns:oel="http://schemas.microsoft.com/office/2019/extlst" xmlns:r="http://schemas.openxmlformats.org/officeDocument/2006/relationships" xmlns:m="http://schemas.openxmlformats.org/officeDocument/2006/math" xmlns:v="urn:schemas-microsoft-com:vml" xmlns:wp14="http://schemas.microsoft.com/office/word/2010/wordprocessingDrawing" xmlns:wp="http://schemas.openxmlformats.org/drawingml/2006/wordprocessingDrawing" xmlns:w10="urn:schemas-microsoft-com:office:word" xmlns:w="http://schemas.openxmlformats.org/wordprocessingml/2006/main" xmlns:w14="http://schemas.microsoft.com/office/word/2010/wordml" xmlns:w15="http://schemas.microsoft.com/office/word/2012/wordml" xmlns:w16cex="http://schemas.microsoft.com/office/word/2018/wordml/cex" xmlns:w16cid="http://schemas.microsoft.com/office/word/2016/wordml/cid" xmlns:w16="http://schemas.microsoft.com/office/word/2018/wordml" xmlns:w16du="http://schemas.microsoft.com/office/word/2023/wordml/word16du" xmlns:w16sdtdh="http://schemas.microsoft.com/office/word/2020/wordml/sdtdatahash" xmlns:w16sdtfl="http://schemas.microsoft.com/office/word/2024/wordml/sdtformatlock" xmlns:w16se="http://schemas.microsoft.com/office/word/2015/wordml/symex" xmlns:wpg="http://schemas.microsoft.com/office/word/2010/wordprocessingGroup" xmlns:wpi="http://schemas.microsoft.com/office/word/2010/wordprocessingInk" xmlns:wne="http://schemas.microsoft.com/office/word/2006/wordml" xmlns:wps="http://schemas.microsoft.com/office/word/2010/wordprocessingShape" mc:Ignorable="w14 w15 w16se w16cid w16 w16cex w16sdtdh w16sdtfl w16du wp14">
+  <w:footnote w:type="separator" w:id="-1">
+    <w:p>
+      <w:pPr>
+        <w:spacing w:after="0" w:line="240" w:lineRule="auto"/>
+      </w:pPr>
+      <w:r>
+        <w:separator/>
+      </w:r>
+    </w:p>
+  </w:footnote>
+  <w:footnote w:type="continuationSeparator" w:id="0">
+    <w:p>
+      <w:pPr>
+        <w:spacing w:after="0" w:line="240" w:lineRule="auto"/>
+      </w:pPr>
+      <w:r>
+        <w:continuationSeparator/>
+      </w:r>
+    </w:p>
+  </w:footnote>
+</w:footnotes>
+</file>
+
+<file path=word/header1.xml><?xml version="1.0" encoding="utf-8"?>
+<w:hdr xmlns:wpc="http://schemas.microsoft.com/office/word/2010/wordprocessingCanvas" xmlns:cx="http://schemas.microsoft.com/office/drawing/2014/chartex" xmlns:cx1="http://schemas.microsoft.com/office/drawing/2015/9/8/chartex" xmlns:cx2="http://schemas.microsoft.com/office/drawing/2015/10/21/chartex" xmlns:cx3="http://schemas.microsoft.com/office/drawing/2016/5/9/chartex" xmlns:cx4="http://schemas.microsoft.com/office/drawing/2016/5/10/chartex" xmlns:cx5="http://schemas.microsoft.com/office/drawing/2016/5/11/chartex" xmlns:cx6="http://schemas.microsoft.com/office/drawing/2016/5/12/chartex" xmlns:cx7="http://schemas.microsoft.com/office/drawing/2016/5/13/chartex" xmlns:cx8="http://schemas.microsoft.com/office/drawing/2016/5/14/chartex" xmlns:mc="http://schemas.openxmlformats.org/markup-compatibility/2006" xmlns:aink="http://schemas.microsoft.com/office/drawing/2016/ink" xmlns:am3d="http://schemas.microsoft.com/office/drawing/2017/model3d" xmlns:o="urn:schemas-microsoft-com:office:office" xmlns:oel="http://schemas.microsoft.com/office/2019/extlst" xmlns:r="http://schemas.openxmlformats.org/officeDocument/2006/relationships" xmlns:m="http://schemas.openxmlformats.org/officeDocument/2006/math" xmlns:v="urn:schemas-microsoft-com:vml" xmlns:wp14="http://schemas.microsoft.com/office/word/2010/wordprocessingDrawing" xmlns:wp="http://schemas.openxmlformats.org/drawingml/2006/wordprocessingDrawing" xmlns:w10="urn:schemas-microsoft-com:office:word" xmlns:w="http://schemas.openxmlformats.org/wordprocessingml/2006/main" xmlns:w14="http://schemas.microsoft.com/office/word/2010/wordml" xmlns:w15="http://schemas.microsoft.com/office/word/2012/wordml" xmlns:w16cex="http://schemas.microsoft.com/office/word/2018/wordml/cex" xmlns:w16cid="http://schemas.microsoft.com/office/word/2016/wordml/cid" xmlns:w16="http://schemas.microsoft.com/office/word/2018/wordml" xmlns:w16du="http://schemas.microsoft.com/office/word/2023/wordml/word16du" xmlns:w16sdtdh="http://schemas.microsoft.com/office/word/2020/wordml/sdtdatahash" xmlns:w16sdtfl="http://schemas.microsoft.com/office/word/2024/wordml/sdtformatlock" xmlns:w16se="http://schemas.microsoft.com/office/word/2015/wordml/symex" xmlns:wpg="http://schemas.microsoft.com/office/word/2010/wordprocessingGroup" xmlns:wpi="http://schemas.microsoft.com/office/word/2010/wordprocessingInk" xmlns:wne="http://schemas.microsoft.com/office/word/2006/wordml" xmlns:wps="http://schemas.microsoft.com/office/word/2010/wordprocessingShape" mc:Ignorable="w14 w15 w16se w16cid w16 w16cex w16sdtdh w16sdtfl w16du wp14">
+  <w:p>
+    <w:pPr>
+      <w:pStyle w:val="a5"/>
+      <w:rPr>
+        <w:lang w:eastAsia="ko-KR"/>
+      </w:rPr>
+    </w:pPr>
+    <w:r>
+      <w:rPr>
+        <w:noProof/>
+      </w:rPr>
+      <w:drawing>
+        <wp:inline distT="0" distB="0" distL="0" distR="0" wp14:anchorId="2D047C4C" wp14:editId="55F0FB17">
+          <wp:extent cx="333375" cy="333375"/>
+          <wp:effectExtent l="0" t="0" r="9525" b="9525"/>
+          <wp:docPr id="1345581285" name="그림 2"/>
+          <wp:cNvGraphicFramePr>
+            <a:graphicFrameLocks xmlns:a="http://schemas.openxmlformats.org/drawingml/2006/main" noChangeAspect="1"/>
+          </wp:cNvGraphicFramePr>
+          <a:graphic xmlns:a="http://schemas.openxmlformats.org/drawingml/2006/main">
+            <a:graphicData uri="http://schemas.openxmlformats.org/drawingml/2006/picture">
+              <pic:pic xmlns:pic="http://schemas.openxmlformats.org/drawingml/2006/picture">
+                <pic:nvPicPr>
+                  <pic:cNvPr id="0" name="Picture 2"/>
+                  <pic:cNvPicPr>
+                    <a:picLocks noChangeAspect="1" noChangeArrowheads="1"/>
+                  </pic:cNvPicPr>
+                </pic:nvPicPr>
+                <pic:blipFill>
+                  <a:blip r:embed="rId1">
+                    <a:extLst>
+                      <a:ext uri="{28A0092B-C50C-407E-A947-70E740481C1C}">
+                        <a14:useLocalDpi xmlns:a14="http://schemas.microsoft.com/office/drawing/2010/main" val="0"/>
+                      </a:ext>
+                    </a:extLst>
+                  </a:blip>
+                  <a:srcRect/>
+                  <a:stretch>
+                    <a:fillRect/>
+                  </a:stretch>
+                </pic:blipFill>
+                <pic:spPr bwMode="auto">
+                  <a:xfrm>
+                    <a:off x="0" y="0"/>
+                    <a:ext cx="333375" cy="333375"/>
+                  </a:xfrm>
+                  <a:prstGeom prst="rect">
+                    <a:avLst/>
+                  </a:prstGeom>
+                  <a:noFill/>
+                  <a:ln>
+                    <a:noFill/>
+                  </a:ln>
+                </pic:spPr>
+              </pic:pic>
+            </a:graphicData>
+          </a:graphic>
+        </wp:inline>
+      </w:drawing>
+    </w:r>
+    <w:r>
+      <w:rPr>
+        <w:rFonts w:hint="eastAsia"/>
+        <w:lang w:eastAsia="ko-KR"/>
+      </w:rPr>
+      <w:t xml:space="preserve">                                                                                             KESGAI ESG경영 템플릿</w:t>
+    </w:r>
+  </w:p>
+</w:hdr>
 </file>
 
 <file path=word/numbering.xml><?xml version="1.0" encoding="utf-8"?>

</xml_diff>

<commit_message>
Update ESG report template with form protection settings
</commit_message>
<xml_diff>
--- a/engine/ESG_보고서_템플릿.docx
+++ b/engine/ESG_보고서_템플릿.docx
@@ -53,6 +53,7 @@
           <w:lang w:eastAsia="ko-KR"/>
         </w:rPr>
       </w:pPr>
+      <w:permStart w:id="1285820211" w:edGrp="everyone"/>
       <w:r>
         <w:rPr>
           <w:rFonts w:hint="eastAsia"/>
@@ -74,7 +75,30 @@
           <w:sz w:val="22"/>
           <w:lang w:eastAsia="ko-KR"/>
         </w:rPr>
-        <w:t>명: _______________________________</w:t>
+        <w:t>명</w:t>
+      </w:r>
+      <w:r>
+        <w:rPr>
+          <w:rFonts w:hint="eastAsia"/>
+          <w:sz w:val="22"/>
+          <w:lang w:eastAsia="ko-KR"/>
+        </w:rPr>
+        <w:t xml:space="preserve"> </w:t>
+      </w:r>
+      <w:r>
+        <w:rPr>
+          <w:sz w:val="22"/>
+          <w:lang w:eastAsia="ko-KR"/>
+        </w:rPr>
+        <w:t>:</w:t>
+      </w:r>
+      <w:r>
+        <w:rPr>
+          <w:rFonts w:hint="eastAsia"/>
+          <w:sz w:val="22"/>
+          <w:lang w:eastAsia="ko-KR"/>
+        </w:rPr>
+        <w:t xml:space="preserve"> </w:t>
       </w:r>
     </w:p>
     <w:p>
@@ -92,7 +116,6 @@
         </w:rPr>
         <w:t>기업(기관)</w:t>
       </w:r>
-      <w:proofErr w:type="gramStart"/>
       <w:r>
         <w:rPr>
           <w:rFonts w:hint="eastAsia"/>
@@ -106,13 +129,12 @@
         </w:rPr>
         <w:t xml:space="preserve"> :</w:t>
       </w:r>
-      <w:proofErr w:type="gramEnd"/>
       <w:r>
         <w:rPr>
-          <w:sz w:val="22"/>
+          <w:rFonts w:hint="eastAsia"/>
           <w:lang w:eastAsia="ko-KR"/>
         </w:rPr>
-        <w:t xml:space="preserve"> _______________________________</w:t>
+        <w:t xml:space="preserve"> </w:t>
       </w:r>
     </w:p>
     <w:p>
@@ -123,27 +145,18 @@
           <w:lang w:eastAsia="ko-KR"/>
         </w:rPr>
       </w:pPr>
-      <w:proofErr w:type="gramStart"/>
       <w:r>
         <w:rPr>
           <w:lang w:eastAsia="ko-KR"/>
         </w:rPr>
         <w:t>산업분류 :</w:t>
       </w:r>
-      <w:proofErr w:type="gramEnd"/>
       <w:r>
         <w:rPr>
           <w:rFonts w:hint="eastAsia"/>
           <w:lang w:eastAsia="ko-KR"/>
         </w:rPr>
         <w:t xml:space="preserve"> </w:t>
-      </w:r>
-      <w:r>
-        <w:rPr>
-          <w:sz w:val="22"/>
-          <w:lang w:eastAsia="ko-KR"/>
-        </w:rPr>
-        <w:t>_______________________________</w:t>
       </w:r>
     </w:p>
     <w:p>
@@ -159,7 +172,30 @@
           <w:sz w:val="22"/>
           <w:lang w:eastAsia="ko-KR"/>
         </w:rPr>
-        <w:t>보고기간: _______________________________</w:t>
+        <w:t>보고기간</w:t>
+      </w:r>
+      <w:r>
+        <w:rPr>
+          <w:rFonts w:hint="eastAsia"/>
+          <w:sz w:val="22"/>
+          <w:lang w:eastAsia="ko-KR"/>
+        </w:rPr>
+        <w:t xml:space="preserve"> </w:t>
+      </w:r>
+      <w:r>
+        <w:rPr>
+          <w:sz w:val="22"/>
+          <w:lang w:eastAsia="ko-KR"/>
+        </w:rPr>
+        <w:t>:</w:t>
+      </w:r>
+      <w:r>
+        <w:rPr>
+          <w:rFonts w:hint="eastAsia"/>
+          <w:sz w:val="22"/>
+          <w:lang w:eastAsia="ko-KR"/>
+        </w:rPr>
+        <w:t xml:space="preserve"> </w:t>
       </w:r>
     </w:p>
     <w:p>
@@ -176,19 +212,33 @@
           <w:sz w:val="22"/>
           <w:lang w:eastAsia="ko-KR"/>
         </w:rPr>
-        <w:t>작성일: _______________________________</w:t>
+        <w:t>작성일</w:t>
       </w:r>
-    </w:p>
-    <w:p>
-      <w:pPr>
-        <w:spacing w:after="240"/>
-        <w:ind w:leftChars="675" w:left="1418"/>
+      <w:r>
+        <w:rPr>
+          <w:rFonts w:hint="eastAsia"/>
+          <w:sz w:val="22"/>
+          <w:lang w:eastAsia="ko-KR"/>
+        </w:rPr>
+        <w:t xml:space="preserve"> </w:t>
+      </w:r>
+      <w:r>
         <w:rPr>
           <w:sz w:val="22"/>
           <w:lang w:eastAsia="ko-KR"/>
         </w:rPr>
-      </w:pPr>
+        <w:t>:</w:t>
+      </w:r>
+      <w:r>
+        <w:rPr>
+          <w:rFonts w:hint="eastAsia"/>
+          <w:sz w:val="22"/>
+          <w:lang w:eastAsia="ko-KR"/>
+        </w:rPr>
+        <w:t xml:space="preserve"> </w:t>
+      </w:r>
     </w:p>
+    <w:permEnd w:id="1285820211"/>
     <w:p>
       <w:pPr>
         <w:spacing w:after="240"/>
@@ -244,7 +294,35 @@
           <w:rFonts w:hint="eastAsia"/>
           <w:lang w:eastAsia="ko-KR"/>
         </w:rPr>
-        <w:t>기관(기업) 맞춤형 ESG 가이드라인 템플릿 초안입니다.</w:t>
+        <w:t xml:space="preserve">기관(기업) 맞춤형 ESG 가이드라인 </w:t>
+      </w:r>
+      <w:r>
+        <w:rPr>
+          <w:rFonts w:hint="eastAsia"/>
+          <w:lang w:eastAsia="ko-KR"/>
+        </w:rPr>
+        <w:t xml:space="preserve">참고 </w:t>
+      </w:r>
+      <w:r>
+        <w:rPr>
+          <w:rFonts w:hint="eastAsia"/>
+          <w:lang w:eastAsia="ko-KR"/>
+        </w:rPr>
+        <w:t>템플릿 초안</w:t>
+      </w:r>
+      <w:r>
+        <w:rPr>
+          <w:rFonts w:hint="eastAsia"/>
+          <w:lang w:eastAsia="ko-KR"/>
+        </w:rPr>
+        <w:t>(Level 1)</w:t>
+      </w:r>
+      <w:r>
+        <w:rPr>
+          <w:rFonts w:hint="eastAsia"/>
+          <w:lang w:eastAsia="ko-KR"/>
+        </w:rPr>
+        <w:t>입니다.</w:t>
       </w:r>
     </w:p>
     <w:p>
@@ -255,12 +333,79 @@
           <w:lang w:eastAsia="ko-KR"/>
         </w:rPr>
       </w:pPr>
+    </w:p>
+    <w:p>
+      <w:pPr>
+        <w:spacing w:after="0" w:line="200" w:lineRule="atLeast"/>
+        <w:jc w:val="center"/>
+        <w:rPr>
+          <w:b/>
+          <w:bCs/>
+          <w:lang w:eastAsia="ko-KR"/>
+        </w:rPr>
+      </w:pPr>
       <w:r>
         <w:rPr>
           <w:rFonts w:hint="eastAsia"/>
+          <w:b/>
+          <w:bCs/>
           <w:lang w:eastAsia="ko-KR"/>
         </w:rPr>
-        <w:t>실제 현황에 맞게 직접 보완하시기 바랍니다.</w:t>
+        <w:t xml:space="preserve">실제 </w:t>
+      </w:r>
+      <w:r>
+        <w:rPr>
+          <w:rFonts w:hint="eastAsia"/>
+          <w:b/>
+          <w:bCs/>
+          <w:lang w:eastAsia="ko-KR"/>
+        </w:rPr>
+        <w:t>공시, 인증,</w:t>
+      </w:r>
+      <w:r>
+        <w:rPr>
+          <w:rFonts w:hint="eastAsia"/>
+          <w:b/>
+          <w:bCs/>
+          <w:lang w:eastAsia="ko-KR"/>
+        </w:rPr>
+        <w:t xml:space="preserve"> 활</w:t>
+      </w:r>
+      <w:r>
+        <w:rPr>
+          <w:rFonts w:hint="eastAsia"/>
+          <w:b/>
+          <w:bCs/>
+          <w:lang w:eastAsia="ko-KR"/>
+        </w:rPr>
+        <w:t xml:space="preserve">용 및 </w:t>
+      </w:r>
+      <w:r>
+        <w:rPr>
+          <w:rFonts w:hint="eastAsia"/>
+          <w:b/>
+          <w:bCs/>
+          <w:lang w:eastAsia="ko-KR"/>
+        </w:rPr>
+        <w:t xml:space="preserve">대외 </w:t>
+      </w:r>
+      <w:r>
+        <w:rPr>
+          <w:rFonts w:hint="eastAsia"/>
+          <w:b/>
+          <w:bCs/>
+          <w:lang w:eastAsia="ko-KR"/>
+        </w:rPr>
+        <w:t>제출</w:t>
+      </w:r>
+      <w:r>
+        <w:rPr>
+          <w:rFonts w:hint="eastAsia"/>
+          <w:b/>
+          <w:bCs/>
+          <w:lang w:eastAsia="ko-KR"/>
+        </w:rPr>
+        <w:t>을 위해서는 기업별 데이터기반의</w:t>
       </w:r>
     </w:p>
     <w:p>
@@ -280,9 +425,19 @@
           <w:bCs/>
           <w:lang w:eastAsia="ko-KR"/>
         </w:rPr>
-        <w:t xml:space="preserve">&lt;KESGAI는 Korea ESG Association </w:t>
+        <w:t>심층분석 및 맞춤형 ESG전략수립(Level 2이상)이 필요합니다.</w:t>
       </w:r>
-      <w:proofErr w:type="gramStart"/>
+    </w:p>
+    <w:p>
+      <w:pPr>
+        <w:spacing w:after="0" w:line="200" w:lineRule="atLeast"/>
+        <w:jc w:val="center"/>
+        <w:rPr>
+          <w:b/>
+          <w:bCs/>
+          <w:lang w:eastAsia="ko-KR"/>
+        </w:rPr>
+      </w:pPr>
       <w:r>
         <w:rPr>
           <w:rFonts w:hint="eastAsia"/>
@@ -290,7 +445,7 @@
           <w:bCs/>
           <w:lang w:eastAsia="ko-KR"/>
         </w:rPr>
-        <w:t>A</w:t>
+        <w:t>한국ESG학회</w:t>
       </w:r>
       <w:r>
         <w:rPr>
@@ -299,8 +454,19 @@
           <w:bCs/>
           <w:lang w:eastAsia="ko-KR"/>
         </w:rPr>
-        <w:t xml:space="preserve">I엔진 </w:t>
+        <w:t>는 산업별 특성과 기업현황을 반영한 전문가 검증기반</w:t>
       </w:r>
+    </w:p>
+    <w:p>
+      <w:pPr>
+        <w:spacing w:after="0" w:line="200" w:lineRule="atLeast"/>
+        <w:jc w:val="center"/>
+        <w:rPr>
+          <w:b/>
+          <w:bCs/>
+          <w:lang w:eastAsia="ko-KR"/>
+        </w:rPr>
+      </w:pPr>
       <w:r>
         <w:rPr>
           <w:rFonts w:hint="eastAsia"/>
@@ -308,32 +474,13 @@
           <w:bCs/>
           <w:lang w:eastAsia="ko-KR"/>
         </w:rPr>
-        <w:t>입니다</w:t>
-      </w:r>
-      <w:proofErr w:type="gramEnd"/>
-      <w:r>
-        <w:rPr>
-          <w:rFonts w:hint="eastAsia"/>
-          <w:b/>
-          <w:bCs/>
-          <w:lang w:eastAsia="ko-KR"/>
-        </w:rPr>
-        <w:t>.&gt;</w:t>
+        <w:t xml:space="preserve"> ESG보고서 고도화 서비스를 제공합니다.</w:t>
       </w:r>
     </w:p>
     <w:p>
       <w:pPr>
-        <w:spacing w:after="240"/>
-        <w:ind w:leftChars="675" w:left="1418"/>
-        <w:rPr>
-          <w:lang w:eastAsia="ko-KR"/>
-        </w:rPr>
-      </w:pPr>
-    </w:p>
-    <w:p>
-      <w:pPr>
-        <w:spacing w:after="240"/>
-        <w:ind w:leftChars="675" w:left="1418"/>
+        <w:spacing w:after="0" w:line="200" w:lineRule="atLeast"/>
+        <w:jc w:val="center"/>
         <w:rPr>
           <w:lang w:eastAsia="ko-KR"/>
         </w:rPr>
@@ -412,35 +559,25 @@
     </w:p>
     <w:p>
       <w:pPr>
-        <w:jc w:val="center"/>
-        <w:rPr>
-          <w:lang w:eastAsia="ko-KR"/>
-        </w:rPr>
-      </w:pPr>
-    </w:p>
-    <w:p>
-      <w:pPr>
         <w:spacing w:after="0"/>
         <w:jc w:val="right"/>
         <w:rPr>
           <w:lang w:eastAsia="ko-KR"/>
         </w:rPr>
       </w:pPr>
-      <w:proofErr w:type="gramStart"/>
       <w:r>
         <w:rPr>
           <w:rFonts w:hint="eastAsia"/>
           <w:lang w:eastAsia="ko-KR"/>
         </w:rPr>
-        <w:t>문의 :</w:t>
+        <w:t>문의 : 한국ESG학회 KESGA</w:t>
       </w:r>
-      <w:proofErr w:type="gramEnd"/>
       <w:r>
         <w:rPr>
           <w:rFonts w:hint="eastAsia"/>
           <w:lang w:eastAsia="ko-KR"/>
         </w:rPr>
-        <w:t xml:space="preserve"> 한국ESG학회 KESGAI보고서 지원</w:t>
+        <w:t>I SaaS 플랫폼</w:t>
       </w:r>
     </w:p>
     <w:p>
@@ -474,8 +611,82 @@
         </w:rPr>
         <w:t>)</w:t>
       </w:r>
+    </w:p>
+    <w:p>
+      <w:pPr>
+        <w:spacing w:after="0"/>
+        <w:jc w:val="right"/>
+        <w:rPr>
+          <w:lang w:eastAsia="ko-KR"/>
+        </w:rPr>
+      </w:pPr>
       <w:r>
         <w:rPr>
+          <w:lang w:eastAsia="ko-KR"/>
+        </w:rPr>
+        <w:t xml:space="preserve">홈페이지 </w:t>
+      </w:r>
+      <w:hyperlink r:id="rId9" w:history="1">
+        <w:r>
+          <w:rPr>
+            <w:rStyle w:val="aff1"/>
+            <w:lang w:eastAsia="ko-KR"/>
+          </w:rPr>
+          <w:t>http://www.kesga.org</w:t>
+        </w:r>
+      </w:hyperlink>
+    </w:p>
+    <w:p>
+      <w:pPr>
+        <w:spacing w:after="0"/>
+        <w:jc w:val="right"/>
+        <w:rPr>
+          <w:lang w:eastAsia="ko-KR"/>
+        </w:rPr>
+      </w:pPr>
+    </w:p>
+    <w:p>
+      <w:pPr>
+        <w:spacing w:after="0" w:line="200" w:lineRule="atLeast"/>
+        <w:rPr>
+          <w:b/>
+          <w:color w:val="1F497D"/>
+          <w:sz w:val="28"/>
+          <w:lang w:eastAsia="ko-KR"/>
+        </w:rPr>
+      </w:pPr>
+      <w:r>
+        <w:rPr>
+          <w:rFonts w:hint="eastAsia"/>
+          <w:b/>
+          <w:bCs/>
+          <w:lang w:eastAsia="ko-KR"/>
+        </w:rPr>
+        <w:t>&lt;KESGAI는 Korea ESG Association A</w:t>
+      </w:r>
+      <w:r>
+        <w:rPr>
+          <w:rFonts w:hint="eastAsia"/>
+          <w:b/>
+          <w:bCs/>
+          <w:lang w:eastAsia="ko-KR"/>
+        </w:rPr>
+        <w:t xml:space="preserve">I엔진 </w:t>
+      </w:r>
+      <w:r>
+        <w:rPr>
+          <w:rFonts w:hint="eastAsia"/>
+          <w:b/>
+          <w:bCs/>
+          <w:lang w:eastAsia="ko-KR"/>
+        </w:rPr>
+        <w:t>입니다.&gt;</w:t>
+      </w:r>
+      <w:r>
+        <w:rPr>
+          <w:b/>
+          <w:color w:val="1F497D"/>
+          <w:sz w:val="28"/>
           <w:lang w:eastAsia="ko-KR"/>
         </w:rPr>
         <w:br w:type="page"/>
@@ -483,11 +694,11 @@
     </w:p>
     <w:p>
       <w:pPr>
-        <w:spacing w:before="240" w:after="120"/>
         <w:rPr>
           <w:lang w:eastAsia="ko-KR"/>
         </w:rPr>
       </w:pPr>
+      <w:permStart w:id="1313504075" w:edGrp="everyone"/>
       <w:r>
         <w:rPr>
           <w:b/>
@@ -578,7 +789,20 @@
               <w:rPr>
                 <w:lang w:eastAsia="ko-KR"/>
               </w:rPr>
-              <w:t>[회사명]은 [업종] 분야에서 [주요 제품/서비스]를 중심으로 사업을 영위하고 있으며, 지속가능한 성장 기반 마련을 위해 경영 체계를 고도화하고 있습니다.</w:t>
+              <w:t>[회사명]은</w:t>
+            </w:r>
+            <w:r>
+              <w:rPr>
+                <w:rFonts w:hint="eastAsia"/>
+                <w:lang w:eastAsia="ko-KR"/>
+              </w:rPr>
+              <w:t>(는)</w:t>
+            </w:r>
+            <w:r>
+              <w:rPr>
+                <w:lang w:eastAsia="ko-KR"/>
+              </w:rPr>
+              <w:t xml:space="preserve"> [업종] 분야에서 [주요 제품/서비스]를 중심으로 사업을 영위하고 있으며, 지속가능한 성장 기반 마련을 위해 경영 체계를 고도화하고 있습니다.</w:t>
             </w:r>
           </w:p>
         </w:tc>
@@ -787,7 +1011,7 @@
               <w:rPr>
                 <w:lang w:eastAsia="ko-KR"/>
               </w:rPr>
-              <w:t>[회사명]의 주요 제품 및 서비스는 [</w:t>
+              <w:t>주요 제품 및 서비스는 [</w:t>
             </w:r>
             <w:proofErr w:type="spellStart"/>
             <w:r>
@@ -1010,7 +1234,20 @@
               <w:rPr>
                 <w:lang w:eastAsia="ko-KR"/>
               </w:rPr>
-              <w:t>[회사명]은 [주요 지역]을 중심으로 사업장을 운영하며 안정적인 사업 수행 체계를 구축하고 있습니다.</w:t>
+              <w:t>[회사명]은</w:t>
+            </w:r>
+            <w:r>
+              <w:rPr>
+                <w:rFonts w:hint="eastAsia"/>
+                <w:lang w:eastAsia="ko-KR"/>
+              </w:rPr>
+              <w:t>(는)</w:t>
+            </w:r>
+            <w:r>
+              <w:rPr>
+                <w:lang w:eastAsia="ko-KR"/>
+              </w:rPr>
+              <w:t xml:space="preserve"> [주요 지역]을 중심으로 사업장을 운영하며 안정적인 사업 수행 체계를 구축하고 있습니다.</w:t>
             </w:r>
           </w:p>
         </w:tc>
@@ -1240,7 +1477,7 @@
               <w:rPr>
                 <w:lang w:eastAsia="ko-KR"/>
               </w:rPr>
-              <w:t>[회사명]은 ESG 경영 체계 구축 및 지속가능경영 추진을 위해 환경적 책임, 사회적 가치, 투명한 지배구조를 경영 전반에 반영하고 있습니다.</w:t>
+              <w:t>ESG 경영 체계 구축 및 지속가능경영 추진을 위해 환경적 책임, 사회적 가치, 투명한 지배구조를 경영 전반에 반영하고 있습니다.</w:t>
             </w:r>
           </w:p>
         </w:tc>
@@ -2214,7 +2451,7 @@
               <w:rPr>
                 <w:lang w:eastAsia="ko-KR"/>
               </w:rPr>
-              <w:t>[회사명]은 사업 특성과 이해관계자 요구를 고려하여 우선 관리가 필요한 ESG 영역을 선정하였습니다.</w:t>
+              <w:t>사업 특성과 이해관계자 요구를 고려하여 우선 관리가 필요한 ESG 영역을 선정하였습니다.</w:t>
             </w:r>
           </w:p>
         </w:tc>
@@ -2436,7 +2673,7 @@
               <w:rPr>
                 <w:lang w:eastAsia="ko-KR"/>
               </w:rPr>
-              <w:t>[회사명]은 에너지 효율 개선과 온실가스 배출 저감을 포함한 환경경영 활동을 추진하고 있습니다.</w:t>
+              <w:t>에너지 효율 개선과 온실가스 배출 저감을 포함한 환경경영 활동을 추진하고 있습니다.</w:t>
             </w:r>
           </w:p>
         </w:tc>
@@ -2668,7 +2905,7 @@
               <w:rPr>
                 <w:lang w:eastAsia="ko-KR"/>
               </w:rPr>
-              <w:t>[회사명]은 환경경영 체계 강화를 위해 중장기적 개선 과제를 검토하고 있습니다.</w:t>
+              <w:t>환경경영 체계 강화를 위해 중장기적 개선 과제를 검토하고 있습니다.</w:t>
             </w:r>
           </w:p>
         </w:tc>
@@ -2863,7 +3100,7 @@
               <w:rPr>
                 <w:lang w:eastAsia="ko-KR"/>
               </w:rPr>
-              <w:t>[회사명]은 환경 성과 관리를 위해 핵심 수치를 체계적으로 관리하고 있습니다.</w:t>
+              <w:t>환경 성과 관리를 위해 핵심 수치를 체계적으로 관리하고 있습니다.</w:t>
             </w:r>
           </w:p>
         </w:tc>
@@ -2883,7 +3120,6 @@
               <w:rPr>
                 <w:b/>
               </w:rPr>
-              <w:lastRenderedPageBreak/>
               <w:t>[</w:t>
             </w:r>
             <w:proofErr w:type="spellStart"/>
@@ -2943,6 +3179,7 @@
               <w:rPr>
                 <w:lang w:eastAsia="ko-KR"/>
               </w:rPr>
+              <w:lastRenderedPageBreak/>
               <w:t>- 온실가스 배출량</w:t>
             </w:r>
           </w:p>
@@ -2963,6 +3200,7 @@
               <w:rPr>
                 <w:b/>
               </w:rPr>
+              <w:lastRenderedPageBreak/>
               <w:t>[</w:t>
             </w:r>
             <w:proofErr w:type="spellStart"/>
@@ -3082,7 +3320,7 @@
               <w:rPr>
                 <w:lang w:eastAsia="ko-KR"/>
               </w:rPr>
-              <w:t>[회사명]은 임직원의 근로환경 개선과 복지 증진을 위해 인사·복지 제도를 운영하고 있습니다.</w:t>
+              <w:t>임직원의 근로환경 개선과 복지 증진을 위해 인사·복지 제도를 운영하고 있습니다.</w:t>
             </w:r>
           </w:p>
         </w:tc>
@@ -3314,7 +3552,7 @@
               <w:rPr>
                 <w:lang w:eastAsia="ko-KR"/>
               </w:rPr>
-              <w:t>[회사명]은 구성원의 안전 확보와 역량 강화를 위해 관련 활동을 지속적으로 추진하고 있습니다.</w:t>
+              <w:t>구성원의 안전 확보와 역량 강화를 위해 관련 활동을 지속적으로 추진하고 있습니다.</w:t>
             </w:r>
           </w:p>
         </w:tc>
@@ -3509,7 +3747,7 @@
               <w:rPr>
                 <w:lang w:eastAsia="ko-KR"/>
               </w:rPr>
-              <w:t>[회사명]은 사회 부문 주요 성과를 정량·정성 지표로 관리하고 있습니다.</w:t>
+              <w:t>사회 부문 주요 성과를 정량·정성 지표로 관리하고 있습니다.</w:t>
             </w:r>
           </w:p>
         </w:tc>
@@ -3740,14 +3978,7 @@
               <w:rPr>
                 <w:lang w:eastAsia="ko-KR"/>
               </w:rPr>
-              <w:t xml:space="preserve">[회사명]은 투명한 의사결정과 책임경영 실현을 위해 거버넌스 체계를 운영하고 </w:t>
-            </w:r>
-            <w:r>
-              <w:rPr>
-                <w:lang w:eastAsia="ko-KR"/>
-              </w:rPr>
-              <w:lastRenderedPageBreak/>
-              <w:t>있습니다.</w:t>
+              <w:t>투명한 의사결정과 책임경영 실현을 위해 거버넌스 체계를 운영하고 있습니다.</w:t>
             </w:r>
           </w:p>
         </w:tc>
@@ -3770,7 +4001,6 @@
               <w:rPr>
                 <w:b/>
               </w:rPr>
-              <w:lastRenderedPageBreak/>
               <w:t>[</w:t>
             </w:r>
             <w:proofErr w:type="spellStart"/>
@@ -3841,6 +4071,7 @@
               <w:rPr>
                 <w:b/>
               </w:rPr>
+              <w:lastRenderedPageBreak/>
               <w:t>[</w:t>
             </w:r>
             <w:proofErr w:type="spellStart"/>
@@ -3947,7 +4178,7 @@
               <w:rPr>
                 <w:lang w:eastAsia="ko-KR"/>
               </w:rPr>
-              <w:t>[회사명]은 윤리경영과 내부통제 강화를 위해 관련 기준과 절차를 정비하고 있습니다.</w:t>
+              <w:t>윤리경영과 내부통제 강화를 위해 관련 기준과 절차를 정비하고 있습니다.</w:t>
             </w:r>
           </w:p>
         </w:tc>
@@ -4188,7 +4419,7 @@
               <w:rPr>
                 <w:lang w:eastAsia="ko-KR"/>
               </w:rPr>
-              <w:t>[회사명]은 ESG 핵심 성과를 관리하기 위해 주요 정량 지표를 정리하고 있습니다.</w:t>
+              <w:t>ESG 핵심 성과를 관리하기 위해 주요 정량 지표를 정리하고 있습니다.</w:t>
             </w:r>
           </w:p>
         </w:tc>
@@ -4431,7 +4662,7 @@
               <w:rPr>
                 <w:lang w:eastAsia="ko-KR"/>
               </w:rPr>
-              <w:t>[회사명]은 ESG 관련 정책문서, 인증서, 내부 운영 자료 등을 기반으로 보고서 작성 근거를 정리하고 있습니다.</w:t>
+              <w:t>ESG 관련 정책문서, 인증서, 내부 운영 자료 등을 기반으로 보고서 작성 근거를 정리하고 있습니다.</w:t>
             </w:r>
           </w:p>
         </w:tc>
@@ -4553,7 +4784,6 @@
           </w:p>
           <w:p>
             <w:r>
-              <w:lastRenderedPageBreak/>
               <w:t>______________________________________________</w:t>
             </w:r>
           </w:p>
@@ -4607,6 +4837,7 @@
               <w:rPr>
                 <w:b/>
               </w:rPr>
+              <w:lastRenderedPageBreak/>
               <w:t>[</w:t>
             </w:r>
             <w:proofErr w:type="spellStart"/>
@@ -4641,7 +4872,20 @@
               <w:rPr>
                 <w:lang w:eastAsia="ko-KR"/>
               </w:rPr>
-              <w:t>[회사명]은 기업 현황에 따라 필요한 내용을 추가로 반영하여 보고서 완성도를 높이고 있습니다.</w:t>
+              <w:t>[회사명]은</w:t>
+            </w:r>
+            <w:r>
+              <w:rPr>
+                <w:rFonts w:hint="eastAsia"/>
+                <w:lang w:eastAsia="ko-KR"/>
+              </w:rPr>
+              <w:t>(는)</w:t>
+            </w:r>
+            <w:r>
+              <w:rPr>
+                <w:lang w:eastAsia="ko-KR"/>
+              </w:rPr>
+              <w:t xml:space="preserve"> 기업 현황에 따라 필요한 내용을 추가로 반영하여 보고서 완성도를 높이고 있습니다.</w:t>
             </w:r>
           </w:p>
         </w:tc>
@@ -4773,11 +5017,92 @@
           </w:p>
         </w:tc>
       </w:tr>
+      <w:permEnd w:id="1313504075"/>
     </w:tbl>
-    <w:p/>
     <w:p>
       <w:pPr>
-        <w:spacing w:before="240" w:after="0"/>
+        <w:rPr>
+          <w:lang w:eastAsia="ko-KR"/>
+        </w:rPr>
+      </w:pPr>
+    </w:p>
+    <w:p>
+      <w:pPr>
+        <w:rPr>
+          <w:lang w:eastAsia="ko-KR"/>
+        </w:rPr>
+      </w:pPr>
+    </w:p>
+    <w:p>
+      <w:pPr>
+        <w:jc w:val="center"/>
+        <w:rPr>
+          <w:b/>
+          <w:bCs/>
+          <w:sz w:val="24"/>
+          <w:szCs w:val="28"/>
+          <w:lang w:eastAsia="ko-KR"/>
+        </w:rPr>
+      </w:pPr>
+      <w:r>
+        <w:rPr>
+          <w:b/>
+          <w:bCs/>
+          <w:sz w:val="24"/>
+          <w:szCs w:val="28"/>
+          <w:lang w:eastAsia="ko-KR"/>
+        </w:rPr>
+        <w:t xml:space="preserve">※ 본 초안은 공시 및 </w:t>
+      </w:r>
+      <w:r>
+        <w:rPr>
+          <w:rFonts w:hint="eastAsia"/>
+          <w:b/>
+          <w:bCs/>
+          <w:sz w:val="24"/>
+          <w:szCs w:val="28"/>
+          <w:lang w:eastAsia="ko-KR"/>
+        </w:rPr>
+        <w:t xml:space="preserve">대외 </w:t>
+      </w:r>
+      <w:r>
+        <w:rPr>
+          <w:b/>
+          <w:bCs/>
+          <w:sz w:val="24"/>
+          <w:szCs w:val="28"/>
+          <w:lang w:eastAsia="ko-KR"/>
+        </w:rPr>
+        <w:t>제출용으로 바로 사용될 수 없습니다.</w:t>
+      </w:r>
+    </w:p>
+    <w:p>
+      <w:pPr>
+        <w:jc w:val="center"/>
+        <w:rPr>
+          <w:lang w:eastAsia="ko-KR"/>
+        </w:rPr>
+      </w:pPr>
+    </w:p>
+    <w:p>
+      <w:pPr>
+        <w:jc w:val="center"/>
+        <w:rPr>
+          <w:lang w:eastAsia="ko-KR"/>
+        </w:rPr>
+      </w:pPr>
+    </w:p>
+    <w:p>
+      <w:pPr>
+        <w:jc w:val="center"/>
+        <w:rPr>
+          <w:rFonts w:hint="eastAsia"/>
+          <w:lang w:eastAsia="ko-KR"/>
+        </w:rPr>
+      </w:pPr>
+    </w:p>
+    <w:p>
+      <w:pPr>
         <w:jc w:val="center"/>
         <w:rPr>
           <w:lang w:eastAsia="ko-KR"/>
@@ -4785,15 +5110,134 @@
       </w:pPr>
       <w:r>
         <w:rPr>
-          <w:color w:val="595959"/>
+          <w:noProof/>
           <w:lang w:eastAsia="ko-KR"/>
         </w:rPr>
-        <w:t>본 문서는 ESG 경영 초안 템플릿입니다. 기업 상황에 맞게 수정하여 사용하시기 바랍니다.</w:t>
+        <w:drawing>
+          <wp:inline distT="0" distB="0" distL="0" distR="0" wp14:anchorId="321F0BDE" wp14:editId="6C171A0A">
+            <wp:extent cx="1914525" cy="559999"/>
+            <wp:effectExtent l="0" t="0" r="0" b="0"/>
+            <wp:docPr id="444361577" name="그림 1"/>
+            <wp:cNvGraphicFramePr>
+              <a:graphicFrameLocks xmlns:a="http://schemas.openxmlformats.org/drawingml/2006/main" noChangeAspect="1"/>
+            </wp:cNvGraphicFramePr>
+            <a:graphic xmlns:a="http://schemas.openxmlformats.org/drawingml/2006/main">
+              <a:graphicData uri="http://schemas.openxmlformats.org/drawingml/2006/picture">
+                <pic:pic xmlns:pic="http://schemas.openxmlformats.org/drawingml/2006/picture">
+                  <pic:nvPicPr>
+                    <pic:cNvPr id="0" name="Picture 1"/>
+                    <pic:cNvPicPr>
+                      <a:picLocks noChangeAspect="1" noChangeArrowheads="1"/>
+                    </pic:cNvPicPr>
+                  </pic:nvPicPr>
+                  <pic:blipFill>
+                    <a:blip r:embed="rId8">
+                      <a:extLst>
+                        <a:ext uri="{28A0092B-C50C-407E-A947-70E740481C1C}">
+                          <a14:useLocalDpi xmlns:a14="http://schemas.microsoft.com/office/drawing/2010/main" val="0"/>
+                        </a:ext>
+                      </a:extLst>
+                    </a:blip>
+                    <a:srcRect/>
+                    <a:stretch>
+                      <a:fillRect/>
+                    </a:stretch>
+                  </pic:blipFill>
+                  <pic:spPr bwMode="auto">
+                    <a:xfrm>
+                      <a:off x="0" y="0"/>
+                      <a:ext cx="1934001" cy="565696"/>
+                    </a:xfrm>
+                    <a:prstGeom prst="rect">
+                      <a:avLst/>
+                    </a:prstGeom>
+                    <a:noFill/>
+                    <a:ln>
+                      <a:noFill/>
+                    </a:ln>
+                  </pic:spPr>
+                </pic:pic>
+              </a:graphicData>
+            </a:graphic>
+          </wp:inline>
+        </w:drawing>
       </w:r>
     </w:p>
+    <w:p>
+      <w:pPr>
+        <w:spacing w:after="0"/>
+        <w:jc w:val="right"/>
+        <w:rPr>
+          <w:lang w:eastAsia="ko-KR"/>
+        </w:rPr>
+      </w:pPr>
+      <w:r>
+        <w:rPr>
+          <w:rFonts w:hint="eastAsia"/>
+          <w:lang w:eastAsia="ko-KR"/>
+        </w:rPr>
+        <w:t>문의 : 한국ESG학회 KESGAI SaaS 플랫폼</w:t>
+      </w:r>
+    </w:p>
+    <w:p>
+      <w:pPr>
+        <w:spacing w:after="0"/>
+        <w:jc w:val="right"/>
+        <w:rPr>
+          <w:lang w:eastAsia="ko-KR"/>
+        </w:rPr>
+      </w:pPr>
+      <w:r>
+        <w:rPr>
+          <w:rFonts w:hint="eastAsia"/>
+          <w:lang w:eastAsia="ko-KR"/>
+        </w:rPr>
+        <w:t>010-5252-4704 (</w:t>
+      </w:r>
+      <w:proofErr w:type="spellStart"/>
+      <w:r>
+        <w:rPr>
+          <w:rFonts w:hint="eastAsia"/>
+          <w:lang w:eastAsia="ko-KR"/>
+        </w:rPr>
+        <w:t>강종진</w:t>
+      </w:r>
+      <w:proofErr w:type="spellEnd"/>
+      <w:r>
+        <w:rPr>
+          <w:rFonts w:hint="eastAsia"/>
+          <w:lang w:eastAsia="ko-KR"/>
+        </w:rPr>
+        <w:t>)</w:t>
+      </w:r>
+    </w:p>
+    <w:p>
+      <w:pPr>
+        <w:spacing w:after="0"/>
+        <w:jc w:val="right"/>
+        <w:rPr>
+          <w:lang w:eastAsia="ko-KR"/>
+        </w:rPr>
+      </w:pPr>
+      <w:r>
+        <w:rPr>
+          <w:lang w:eastAsia="ko-KR"/>
+        </w:rPr>
+        <w:t xml:space="preserve">홈페이지 </w:t>
+      </w:r>
+      <w:hyperlink r:id="rId10" w:history="1">
+        <w:r>
+          <w:rPr>
+            <w:rStyle w:val="aff1"/>
+            <w:lang w:eastAsia="ko-KR"/>
+          </w:rPr>
+          <w:t>http://www.kesga.org</w:t>
+        </w:r>
+      </w:hyperlink>
+    </w:p>
     <w:sectPr>
-      <w:headerReference w:type="default" r:id="rId9"/>
-      <w:footerReference w:type="default" r:id="rId10"/>
+      <w:headerReference w:type="default" r:id="rId11"/>
+      <w:footerReference w:type="default" r:id="rId12"/>
       <w:pgSz w:w="12240" w:h="15840"/>
       <w:pgMar w:top="1134" w:right="1247" w:bottom="1134" w:left="1247" w:header="720" w:footer="720" w:gutter="0"/>
       <w:pgBorders w:offsetFrom="page">
@@ -5623,7 +6067,7 @@
   <w:style w:type="paragraph" w:default="1" w:styleId="a1">
     <w:name w:val="Normal"/>
     <w:qFormat/>
-    <w:rsid w:val="00FC693F"/>
+    <w:rsid w:val="00A14BC4"/>
     <w:rPr>
       <w:rFonts w:ascii="맑은 고딕" w:eastAsia="맑은 고딕" w:hAnsi="맑은 고딕"/>
       <w:sz w:val="21"/>
@@ -5841,7 +6285,6 @@
   <w:style w:type="character" w:default="1" w:styleId="a2">
     <w:name w:val="Default Paragraph Font"/>
     <w:uiPriority w:val="1"/>
-    <w:semiHidden/>
     <w:unhideWhenUsed/>
   </w:style>
   <w:style w:type="table" w:default="1" w:styleId="a3">
@@ -16618,6 +17061,41 @@
       </w:tcPr>
     </w:tblStylePr>
   </w:style>
+  <w:style w:type="character" w:styleId="aff1">
+    <w:name w:val="Hyperlink"/>
+    <w:basedOn w:val="a2"/>
+    <w:uiPriority w:val="99"/>
+    <w:unhideWhenUsed/>
+    <w:rsid w:val="00822B55"/>
+    <w:rPr>
+      <w:color w:val="0000FF" w:themeColor="hyperlink"/>
+      <w:u w:val="single"/>
+    </w:rPr>
+  </w:style>
+  <w:style w:type="character" w:styleId="aff2">
+    <w:name w:val="Unresolved Mention"/>
+    <w:basedOn w:val="a2"/>
+    <w:uiPriority w:val="99"/>
+    <w:semiHidden/>
+    <w:unhideWhenUsed/>
+    <w:rsid w:val="00822B55"/>
+    <w:rPr>
+      <w:color w:val="605E5C"/>
+      <w:shd w:val="clear" w:color="auto" w:fill="E1DFDD"/>
+    </w:rPr>
+  </w:style>
+  <w:style w:type="character" w:styleId="aff3">
+    <w:name w:val="FollowedHyperlink"/>
+    <w:basedOn w:val="a2"/>
+    <w:uiPriority w:val="99"/>
+    <w:semiHidden/>
+    <w:unhideWhenUsed/>
+    <w:rsid w:val="00822B55"/>
+    <w:rPr>
+      <w:color w:val="800080" w:themeColor="followedHyperlink"/>
+      <w:u w:val="single"/>
+    </w:rPr>
+  </w:style>
 </w:styles>
 </file>
 

</xml_diff>